<commit_message>
chore: reorganize explainer and walkthrough assets
Move walkthrough documents into a dedicated folder, add explainer files_with_code assets, and remove obsolete archive zip variants.

Co-authored-by: factory-droid[bot] <138933559+factory-droid[bot]@users.noreply.github.com>
</commit_message>
<xml_diff>
--- a/docs/aheteg_cali_fund_allocation_note.docx
+++ b/docs/aheteg_cali_fund_allocation_note.docx
@@ -29,6 +29,10 @@
       </w:r>
       <w:r>
         <w:br/>
+      </w:r>
+    </w:p>
+    <w:p>
+      <w:r>
         <w:t xml:space="preserve">The approach seeks to balance fairness, transparency, and practicality while recognising the </w:t>
       </w:r>
       <w:r>
@@ -37,11 +41,7 @@
       </w:r>
       <w:r>
         <w:br/>
-        <w:t xml:space="preserve">internationally agreed frameworks and introduces limited structural adjustments to address </w:t>
-      </w:r>
-      <w:r>
-        <w:br/>
-        <w:t>predictable imbalances.</w:t>
+        <w:t>internationally agreed frameworks and introduces limited structural adjustments to address predictable imbalances.</w:t>
       </w:r>
     </w:p>
     <w:p>
@@ -96,8 +96,16 @@
         <w:t xml:space="preserve">To adapt this instrument for allocation rather than contribution purposes, the scale is inverted. </w:t>
       </w:r>
       <w:r>
-        <w:br/>
-        <w:t xml:space="preserve">Under this approach, countries with lower assessed economic capacity receive proportionally </w:t>
+        <w:t xml:space="preserve"> </w:t>
+      </w:r>
+      <w:r>
+        <w:t>Under this approach, countries with lower assessed economic capacity receive</w:t>
+      </w:r>
+      <w:r>
+        <w:t xml:space="preserve"> </w:t>
+      </w:r>
+      <w:r>
+        <w:t xml:space="preserve">proportionally </w:t>
       </w:r>
       <w:proofErr w:type="gramStart"/>
       <w:r>
@@ -119,7 +127,11 @@
         <w:t>Using the inverted UN scale provides a legitimate and stable baseline because it builds directly on an existing multilateral framework rather than introducing an entirely new distribution formula.</w:t>
       </w:r>
       <w:r>
-        <w:br/>
+        <w:t xml:space="preserve"> </w:t>
+      </w:r>
+    </w:p>
+    <w:p>
+      <w:r>
         <w:t>However, the UN scale measures economic capacity rather than biodiversity stewardship responsibilities.</w:t>
       </w:r>
     </w:p>
@@ -128,6 +140,7 @@
         <w:pStyle w:val="Heading2"/>
       </w:pPr>
       <w:r>
+        <w:lastRenderedPageBreak/>
         <w:t>3. Structural Imbalances Created by a Pure Capacity-Based Allocation</w:t>
       </w:r>
     </w:p>
@@ -138,12 +151,23 @@
     </w:p>
     <w:p>
       <w:r>
-        <w:lastRenderedPageBreak/>
         <w:t>Stewardship burdens in large middle-income countries:</w:t>
       </w:r>
       <w:r>
         <w:br/>
-        <w:t xml:space="preserve">Many biodiversity-significant countries fall within the middle-income category. These countries often steward large terrestrial areas and bear substantial biodiversity management costs. Under an inverted capacity </w:t>
+        <w:t>Many biodiversity-significant countries fall within the middle-income category. These</w:t>
+      </w:r>
+      <w:r>
+        <w:t xml:space="preserve"> </w:t>
+      </w:r>
+      <w:r>
+        <w:t>countries often steward large terrestrial areas and bear substantial biodiversity</w:t>
+      </w:r>
+      <w:r>
+        <w:t xml:space="preserve"> </w:t>
+      </w:r>
+      <w:r>
+        <w:t xml:space="preserve">management costs. Under an inverted capacity </w:t>
       </w:r>
       <w:proofErr w:type="gramStart"/>
       <w:r>
@@ -151,7 +175,13 @@
       </w:r>
       <w:proofErr w:type="gramEnd"/>
       <w:r>
-        <w:t xml:space="preserve"> they may receive relatively smaller shares despite their central role in delivering global biodiversity outcomes.</w:t>
+        <w:t xml:space="preserve"> they may receive relatively smalle</w:t>
+      </w:r>
+      <w:r>
+        <w:t xml:space="preserve">r </w:t>
+      </w:r>
+      <w:r>
+        <w:t>shares despite their central role in delivering global biodiversity outcomes.</w:t>
       </w:r>
     </w:p>
     <w:p>
@@ -160,7 +190,19 @@
       </w:r>
       <w:r>
         <w:br/>
-        <w:t>Some SIDS are classified as high income. Under a simple inversion or rules excluding high-income countries, these states could receive reduced allocations or become ineligible. This may not adequately reflect structural challenges including limited administrative scale, climate and disaster vulnerability, narrow economic structures, and disproportionate ocean stewardship responsibilities.</w:t>
+        <w:t>Some SIDS are classified as high income. Under a simple inversion or rules excluding high-income countries, these states could receive reduced allocations or become ineligible. This</w:t>
+      </w:r>
+      <w:r>
+        <w:t xml:space="preserve"> </w:t>
+      </w:r>
+      <w:r>
+        <w:t>may not adequately reflect structural challenges including limited administrative scale,</w:t>
+      </w:r>
+      <w:r>
+        <w:t xml:space="preserve"> </w:t>
+      </w:r>
+      <w:r>
+        <w:t>climate and disaster vulnerability, narrow economic structures, and disproportionate ocean stewardship responsibilities.</w:t>
       </w:r>
     </w:p>
     <w:p>
@@ -173,7 +215,13 @@
     </w:p>
     <w:p>
       <w:r>
-        <w:t>To complement the equity foundation provided by the inverted UN scale, the model introduces two stewardship-oriented components.</w:t>
+        <w:t>To complement the equity foundation provided by the inverted UN scale, the model</w:t>
+      </w:r>
+      <w:r>
+        <w:t xml:space="preserve"> </w:t>
+      </w:r>
+      <w:r>
+        <w:t>introduces two stewardship-oriented components.</w:t>
       </w:r>
     </w:p>
     <w:p>
@@ -193,6 +241,15 @@
       </w:r>
       <w:r>
         <w:t>responsibilities and implementation costs. Under TSAC a portion of the fund is allocated proportionally according to national land surface area and applies to all eligible Parties.</w:t>
+      </w:r>
+      <w:r>
+        <w:t xml:space="preserve"> TSAC is based on the FAOSTAT Land Area (square km) dataset that is available from the World Bank Indicators set based on the latest reported value.</w:t>
+      </w:r>
+      <w:r>
+        <w:rPr>
+          <w:rStyle w:val="FootnoteReference"/>
+        </w:rPr>
+        <w:footnoteReference w:id="1"/>
       </w:r>
     </w:p>
     <w:p>
@@ -229,6 +286,15 @@
       <w:r>
         <w:t xml:space="preserve"> the collective structural conditions faced by SIDS. The component therefore allocates a defined share of resources among eligible SIDS without introducing contested spatial metrics.</w:t>
       </w:r>
+      <w:r>
+        <w:t xml:space="preserve"> The definition of SIDS is based on the UNSD M49 standard that currently lists 39 SIDS.</w:t>
+      </w:r>
+      <w:r>
+        <w:rPr>
+          <w:rStyle w:val="FootnoteReference"/>
+        </w:rPr>
+        <w:footnoteReference w:id="2"/>
+      </w:r>
     </w:p>
     <w:p>
       <w:r>
@@ -244,6 +310,7 @@
         <w:pStyle w:val="Heading2"/>
       </w:pPr>
       <w:r>
+        <w:lastRenderedPageBreak/>
         <w:t>5. Eligibility Considerations</w:t>
       </w:r>
     </w:p>
@@ -257,7 +324,6 @@
         <w:pStyle w:val="Heading2"/>
       </w:pPr>
       <w:r>
-        <w:lastRenderedPageBreak/>
         <w:t>6. Overall Structure</w:t>
       </w:r>
     </w:p>
@@ -271,16 +337,61 @@
         <w:t>1. Equity baseline: the majority of funds are allocated using the inverted UN Scale of Assessments.</w:t>
       </w:r>
       <w:r>
-        <w:br/>
-        <w:t>2. Terrestrial stewardship correction: a portion of funds is allocated proportionally according to land surface area (TSAC).</w:t>
+        <w:t xml:space="preserve"> To avoid cliff effects from a raw inversion between developing country member states, where a number of </w:t>
+      </w:r>
+      <w:r>
+        <w:t xml:space="preserve">developing country </w:t>
+      </w:r>
+      <w:r>
+        <w:t xml:space="preserve">member states have minimum contributions while others are more widely distributed, countries are allocated to bands based on percentage ranges and weighted. </w:t>
       </w:r>
       <w:r>
         <w:br/>
-        <w:t>3. SIDS structural adjustment: a defined portion of funds is distributed among Small Island Developing States (SOSAC).</w:t>
+        <w:t>2. Terrestrial stewardship correction: a portion of funds is allocated proportionally according to land surface area (TSAC)</w:t>
+      </w:r>
+      <w:r>
+        <w:t xml:space="preserve"> based on percentage shares of total land area for each </w:t>
+      </w:r>
+      <w:r>
+        <w:t>member states</w:t>
+      </w:r>
+      <w:r>
+        <w:t>.</w:t>
       </w:r>
       <w:r>
         <w:br/>
-        <w:t>4. Stability mechanisms: floor and ceiling rules can be applied to prevent extreme allocation outcomes.</w:t>
+        <w:t xml:space="preserve">3. SIDS structural </w:t>
+      </w:r>
+      <w:r>
+        <w:t xml:space="preserve">and oceans </w:t>
+      </w:r>
+      <w:r>
+        <w:t>adjustment: a defined portion of funds i</w:t>
+      </w:r>
+      <w:r>
+        <w:t xml:space="preserve">s equally </w:t>
+      </w:r>
+      <w:r>
+        <w:t xml:space="preserve">distributed among </w:t>
+      </w:r>
+      <w:r>
+        <w:t xml:space="preserve">39 </w:t>
+      </w:r>
+      <w:r>
+        <w:t>Small Island Developing States (SOSAC).</w:t>
+      </w:r>
+      <w:r>
+        <w:br/>
+        <w:t>4. Stability mechanisms: floor and ceiling rules can be applied to prevent extreme allocation outcomes</w:t>
+      </w:r>
+      <w:r>
+        <w:t xml:space="preserve"> if required</w:t>
+      </w:r>
+      <w:r>
+        <w:t>.</w:t>
+      </w:r>
+      <w:r>
+        <w:t xml:space="preserve"> They are presently unused.</w:t>
       </w:r>
     </w:p>
     <w:p>
@@ -492,6 +603,50 @@
       </w:pPr>
       <w:r>
         <w:continuationSeparator/>
+      </w:r>
+    </w:p>
+  </w:footnote>
+  <w:footnote w:id="1">
+    <w:p>
+      <w:pPr>
+        <w:pStyle w:val="FootnoteText"/>
+        <w:rPr>
+          <w:lang w:val="en-GB"/>
+        </w:rPr>
+      </w:pPr>
+      <w:r>
+        <w:rPr>
+          <w:rStyle w:val="FootnoteReference"/>
+        </w:rPr>
+        <w:footnoteRef/>
+      </w:r>
+      <w:r>
+        <w:t xml:space="preserve"> </w:t>
+      </w:r>
+      <w:r>
+        <w:t>https://data.worldbank.org/indicator/AG.LND.TOTL.K2</w:t>
+      </w:r>
+    </w:p>
+  </w:footnote>
+  <w:footnote w:id="2">
+    <w:p>
+      <w:pPr>
+        <w:pStyle w:val="FootnoteText"/>
+        <w:rPr>
+          <w:lang w:val="en-GB"/>
+        </w:rPr>
+      </w:pPr>
+      <w:r>
+        <w:rPr>
+          <w:rStyle w:val="FootnoteReference"/>
+        </w:rPr>
+        <w:footnoteRef/>
+      </w:r>
+      <w:r>
+        <w:t xml:space="preserve"> </w:t>
+      </w:r>
+      <w:r>
+        <w:t>https://unstats.un.org/unsd/methodology/m49/</w:t>
       </w:r>
     </w:p>
   </w:footnote>
@@ -12089,6 +12244,45 @@
     <w:unhideWhenUsed/>
     <w:rsid w:val="004D53C4"/>
   </w:style>
+  <w:style w:type="paragraph" w:styleId="FootnoteText">
+    <w:name w:val="footnote text"/>
+    <w:basedOn w:val="Normal"/>
+    <w:link w:val="FootnoteTextChar"/>
+    <w:uiPriority w:val="99"/>
+    <w:semiHidden/>
+    <w:unhideWhenUsed/>
+    <w:rsid w:val="00865EFF"/>
+    <w:pPr>
+      <w:spacing w:after="0" w:line="240" w:lineRule="auto"/>
+    </w:pPr>
+    <w:rPr>
+      <w:sz w:val="20"/>
+      <w:szCs w:val="20"/>
+    </w:rPr>
+  </w:style>
+  <w:style w:type="character" w:customStyle="1" w:styleId="FootnoteTextChar">
+    <w:name w:val="Footnote Text Char"/>
+    <w:basedOn w:val="DefaultParagraphFont"/>
+    <w:link w:val="FootnoteText"/>
+    <w:uiPriority w:val="99"/>
+    <w:semiHidden/>
+    <w:rsid w:val="00865EFF"/>
+    <w:rPr>
+      <w:sz w:val="20"/>
+      <w:szCs w:val="20"/>
+    </w:rPr>
+  </w:style>
+  <w:style w:type="character" w:styleId="FootnoteReference">
+    <w:name w:val="footnote reference"/>
+    <w:basedOn w:val="DefaultParagraphFont"/>
+    <w:uiPriority w:val="99"/>
+    <w:semiHidden/>
+    <w:unhideWhenUsed/>
+    <w:rsid w:val="00865EFF"/>
+    <w:rPr>
+      <w:vertAlign w:val="superscript"/>
+    </w:rPr>
+  </w:style>
 </w:styles>
 </file>
 

</xml_diff>